<commit_message>
Legal and UI texts: cadastral data from official source via AGE (MConnect)
- Politică, Termeni, FAQ, Despre ImoGhid: cadastral data described as coming from the official source (Registrul bunurilor imobile, via AGE), new plain-language section on encumbrance checks, disclaimer on state at time of check, update date 23.10.2026; legal-content.ts regenerated.
- UI: source-dependent note on the check result (live / demo), "Date demonstrative" label for demo and mock data, demo tour and tariff tooltip texts aligned, Step 2 link renamed.

Co-Authored-By: Claude Sonnet 5.5 <noreply@anthropic.com>
</commit_message>
<xml_diff>
--- a/docs/Politică de confidențialitate.docx
+++ b/docs/Politică de confidențialitate.docx
@@ -762,7 +762,7 @@
           <w:szCs w:val="24"/>
           <w:rtl w:val="0"/>
         </w:rPr>
-        <w:t xml:space="preserve">Aplicația utilizează un agent bazat pe inteligență artificială pentru a extrage și verifica informații din documente și pentru a efectua căutări cadastrale. Rezultatele au caracter asistiv și orientativ; Aplicația nu adoptă decizii cu efect juridic exclusiv automatizat, fără intervenție umană. Având în vedere utilizarea unor tehnologii noi, se realizează o Evaluare a impactului asupra protecției datelor (DPIA), conform cadrului legal.</w:t>
+        <w:t xml:space="preserve">Aplicația utilizează un agent bazat pe inteligență artificială exclusiv pentru a extrage și verifica informații din documentele încărcate de utilizator. Datele privind sarcinile, interdicțiile și notările asupra bunurilor imobile nu sunt generate de inteligența artificială: ele provin din sursa oficială (Registrul bunurilor imobile, prin Agenția de Guvernare Electronică). Rezultatele au caracter asistiv și orientativ; Aplicația nu adoptă decizii cu efect juridic exclusiv automatizat, fără intervenție umană. Având în vedere utilizarea unor tehnologii noi, se realizează o Evaluare a impactului asupra protecției datelor (DPIA), conform cadrului legal.</w:t>
       </w:r>
     </w:p>
     <w:p>
@@ -816,7 +816,7 @@
           <w:szCs w:val="24"/>
           <w:rtl w:val="0"/>
         </w:rPr>
-        <w:t xml:space="preserve">datele cadastrale provin din sursele publice (e-Cadastru) și au titlu informativ, fără a produce consecințe juridice;</w:t>
+        <w:t xml:space="preserve">datele privind sarcinile, interdicțiile și notările provin din sursa oficială — Registrul bunurilor imobile, prin Agenția de Guvernare Electronică (AGE) — și au titlu informativ, fără a produce consecințe juridice;</w:t>
       </w:r>
     </w:p>
     <w:p>
@@ -870,7 +870,7 @@
           <w:szCs w:val="25"/>
           <w:rtl w:val="0"/>
         </w:rPr>
-        <w:t xml:space="preserve">Destinatari și persoane împuternicite</w:t>
+        <w:t xml:space="preserve">Verificarea sarcinilor și interdicțiilor</w:t>
       </w:r>
     </w:p>
     <w:p>
@@ -891,7 +891,70 @@
           <w:szCs w:val="24"/>
           <w:rtl w:val="0"/>
         </w:rPr>
-        <w:t xml:space="preserve">Datele pot fi prelucrate de furnizori care acționează la instrucțiunea operatorului. Nu vindem și nu comercializăm datele cu caracter personal.</w:t>
+        <w:t xml:space="preserve">Când verificați un imobil după numărul cadastral, ImoGhid transmite acest număr către Agenția de Guvernare Electronică (prin platforma de interoperabilitate MConnect) și afișează rezultatul: sarcini, interdicții, notări și cotele titularilor de drepturi. Alte date despre dumneavoastră sau despre clienții dumneavoastră nu sunt transmise.</w:t>
+      </w:r>
+    </w:p>
+    <w:p>
+      <w:pPr>
+        <w:spacing w:after="120" w:line="240" w:lineRule="auto"/>
+        <w:ind w:left="-425.19685039370086" w:right="-324.3307086614169" w:firstLine="0"/>
+        <w:jc w:val="both"/>
+        <w:rPr>
+          <w:rFonts w:ascii="Times New Roman" w:cs="Times New Roman" w:eastAsia="Times New Roman" w:hAnsi="Times New Roman"/>
+          <w:sz w:val="24"/>
+          <w:szCs w:val="24"/>
+        </w:rPr>
+      </w:pPr>
+      <w:r>
+        <w:rPr>
+          <w:rFonts w:ascii="Times New Roman" w:cs="Times New Roman" w:eastAsia="Times New Roman" w:hAnsi="Times New Roman"/>
+          <w:sz w:val="24"/>
+          <w:szCs w:val="24"/>
+          <w:rtl w:val="0"/>
+        </w:rPr>
+        <w:t xml:space="preserve">Solicitările sunt făcute din numele ImoGhid („BlackSpace Tech” SRL), printr-o conexiune securizată și autentificată. Datele primite provin din sursa oficială, nu sunt generate de inteligența artificială și reflectă starea imobilului la momentul verificării.</w:t>
+      </w:r>
+    </w:p>
+    <w:p>
+      <w:pPr>
+        <w:spacing w:after="120" w:line="240" w:lineRule="auto"/>
+        <w:ind w:left="-425.19685039370086" w:right="-324.3307086614169" w:firstLine="0"/>
+        <w:jc w:val="both"/>
+        <w:rPr>
+          <w:rFonts w:ascii="Times New Roman" w:cs="Times New Roman" w:eastAsia="Times New Roman" w:hAnsi="Times New Roman"/>
+          <w:sz w:val="24"/>
+          <w:szCs w:val="24"/>
+        </w:rPr>
+      </w:pPr>
+      <w:r>
+        <w:rPr>
+          <w:rFonts w:ascii="Times New Roman" w:cs="Times New Roman" w:eastAsia="Times New Roman" w:hAnsi="Times New Roman"/>
+          <w:sz w:val="24"/>
+          <w:szCs w:val="24"/>
+          <w:rtl w:val="0"/>
+        </w:rPr>
+        <w:t xml:space="preserve">Păstrăm un jurnal al verificărilor efectuate: data și ora, numărul cadastral și rezultatul (găsit / negăsit / eroare). Jurnalul este necesar pentru securitate și pentru a putea răspunde solicitărilor autorităților. Acesta nu conține codul personal (IDNP), numele, e-mailul sau alte date ale contului dumneavoastră. Contul dumneavoastră păstrează doar numărul de verificări efectuate în perioada curentă, pentru respectarea limitelor abonamentului. Dacă creați un dosar pe baza verificării, numărul cadastral și rezultatul se salvează în dosarul din contul dumneavoastră. Termen de păstrare a jurnalului: 12 luni.</w:t>
+      </w:r>
+    </w:p>
+    <w:p>
+      <w:pPr>
+        <w:spacing w:after="120" w:line="240" w:lineRule="auto"/>
+        <w:ind w:left="-425.19685039370086" w:right="-324.3307086614169" w:firstLine="0"/>
+        <w:jc w:val="both"/>
+        <w:rPr>
+          <w:rFonts w:ascii="Times New Roman" w:cs="Times New Roman" w:eastAsia="Times New Roman" w:hAnsi="Times New Roman"/>
+          <w:sz w:val="24"/>
+          <w:szCs w:val="24"/>
+        </w:rPr>
+      </w:pPr>
+      <w:r>
+        <w:rPr>
+          <w:rFonts w:ascii="Times New Roman" w:cs="Times New Roman" w:eastAsia="Times New Roman" w:hAnsi="Times New Roman"/>
+          <w:sz w:val="24"/>
+          <w:szCs w:val="24"/>
+          <w:rtl w:val="0"/>
+        </w:rPr>
+        <w:t xml:space="preserve">Baza prelucrării: executarea serviciului solicitat de dumneavoastră.</w:t>
       </w:r>
     </w:p>
     <w:p>
@@ -920,7 +983,7 @@
           <w:szCs w:val="25"/>
           <w:rtl w:val="0"/>
         </w:rPr>
-        <w:t xml:space="preserve">Perioada de stocare</w:t>
+        <w:t xml:space="preserve">Destinatari și persoane împuternicite</w:t>
       </w:r>
     </w:p>
     <w:p>
@@ -941,7 +1004,7 @@
           <w:szCs w:val="24"/>
           <w:rtl w:val="0"/>
         </w:rPr>
-        <w:t xml:space="preserve">Datele se păstrează doar pe durata necesară scopurilor pentru care au fost colectate și pe durata relației contractuale, plus termenele impuse de obligațiile legale (de ex. fiscale). Ulterior, datele se șterg sau se anonimizează.</w:t>
+        <w:t xml:space="preserve">Datele pot fi prelucrate de furnizori care acționează la instrucțiunea operatorului. Pentru verificarea sarcinilor și interdicțiilor, numărul cadastral este transmis Agenției de Guvernare Electronică (AGE), în condițiile descrise mai sus. Nu vindem și nu comercializăm datele cu caracter personal.</w:t>
       </w:r>
     </w:p>
     <w:p>
@@ -970,7 +1033,7 @@
           <w:szCs w:val="25"/>
           <w:rtl w:val="0"/>
         </w:rPr>
-        <w:t xml:space="preserve">Securitatea datelor</w:t>
+        <w:t xml:space="preserve">Perioada de stocare</w:t>
       </w:r>
     </w:p>
     <w:p>
@@ -991,7 +1054,7 @@
           <w:szCs w:val="24"/>
           <w:rtl w:val="0"/>
         </w:rPr>
-        <w:t xml:space="preserve">Aplicăm măsuri tehnice și organizatorice adecvate: control al accesului, criptare, jurnalizare, separarea mediilor, proceduri de gestionare a incidentelor.</w:t>
+        <w:t xml:space="preserve">Datele se păstrează doar pe durata necesară scopurilor pentru care au fost colectate și pe durata relației contractuale, plus termenele impuse de obligațiile legale (de ex. fiscale). Ulterior, datele se șterg sau se anonimizează.</w:t>
       </w:r>
     </w:p>
     <w:p>
@@ -1020,28 +1083,7 @@
           <w:szCs w:val="25"/>
           <w:rtl w:val="0"/>
         </w:rPr>
-        <w:t xml:space="preserve">Drepturile persoanelor vizate</w:t>
-      </w:r>
-    </w:p>
-    <w:p>
-      <w:pPr>
-        <w:spacing w:line="240" w:lineRule="auto"/>
-        <w:ind w:left="-425.19685039370086" w:right="-324.3307086614169" w:firstLine="0"/>
-        <w:jc w:val="both"/>
-        <w:rPr>
-          <w:rFonts w:ascii="Times New Roman" w:cs="Times New Roman" w:eastAsia="Times New Roman" w:hAnsi="Times New Roman"/>
-          <w:sz w:val="24"/>
-          <w:szCs w:val="24"/>
-        </w:rPr>
-      </w:pPr>
-      <w:r>
-        <w:rPr>
-          <w:rFonts w:ascii="Times New Roman" w:cs="Times New Roman" w:eastAsia="Times New Roman" w:hAnsi="Times New Roman"/>
-          <w:sz w:val="24"/>
-          <w:szCs w:val="24"/>
-          <w:rtl w:val="0"/>
-        </w:rPr>
-        <w:t xml:space="preserve">Persoana vizată are dreptul la informare, acces, rectificare, ștergere, restricționarea prelucrării, opoziție, portabilitate, dreptul de a nu fi supusă unei decizii bazate exclusiv pe prelucrarea automatizată, precum și dreptul de a-și retrage consimțământul. </w:t>
+        <w:t xml:space="preserve">Securitatea datelor</w:t>
       </w:r>
     </w:p>
     <w:p>
@@ -1051,31 +1093,18 @@
         <w:jc w:val="both"/>
         <w:rPr>
           <w:rFonts w:ascii="Times New Roman" w:cs="Times New Roman" w:eastAsia="Times New Roman" w:hAnsi="Times New Roman"/>
-          <w:b w:val="1"/>
-          <w:bCs w:val="1"/>
-          <w:sz w:val="24"/>
-          <w:szCs w:val="24"/>
-        </w:rPr>
-      </w:pPr>
-      <w:r>
-        <w:rPr>
-          <w:rFonts w:ascii="Times New Roman" w:cs="Times New Roman" w:eastAsia="Times New Roman" w:hAnsi="Times New Roman"/>
-          <w:sz w:val="24"/>
-          <w:szCs w:val="24"/>
-          <w:rtl w:val="0"/>
-        </w:rPr>
-        <w:t xml:space="preserve">Drepturile se exercită prin cerere la info@biseeth.md. Răspundem în maximum 36 de ore lucrătoare</w:t>
-      </w:r>
-      <w:r>
-        <w:rPr>
-          <w:rFonts w:ascii="Times New Roman" w:cs="Times New Roman" w:eastAsia="Times New Roman" w:hAnsi="Times New Roman"/>
-          <w:b w:val="1"/>
-          <w:bCs w:val="1"/>
-          <w:sz w:val="24"/>
-          <w:szCs w:val="24"/>
-          <w:rtl w:val="0"/>
-        </w:rPr>
-        <w:t xml:space="preserve">.</w:t>
+          <w:sz w:val="24"/>
+          <w:szCs w:val="24"/>
+        </w:rPr>
+      </w:pPr>
+      <w:r>
+        <w:rPr>
+          <w:rFonts w:ascii="Times New Roman" w:cs="Times New Roman" w:eastAsia="Times New Roman" w:hAnsi="Times New Roman"/>
+          <w:sz w:val="24"/>
+          <w:szCs w:val="24"/>
+          <w:rtl w:val="0"/>
+        </w:rPr>
+        <w:t xml:space="preserve">Aplicăm măsuri tehnice și organizatorice adecvate: control al accesului, criptare, jurnalizare, separarea mediilor, proceduri de gestionare a incidentelor.</w:t>
       </w:r>
     </w:p>
     <w:p>
@@ -1104,7 +1133,28 @@
           <w:szCs w:val="25"/>
           <w:rtl w:val="0"/>
         </w:rPr>
-        <w:t xml:space="preserve">Responsabilitatea utilizatorului pentru datele terților</w:t>
+        <w:t xml:space="preserve">Drepturile persoanelor vizate</w:t>
+      </w:r>
+    </w:p>
+    <w:p>
+      <w:pPr>
+        <w:spacing w:line="240" w:lineRule="auto"/>
+        <w:ind w:left="-425.19685039370086" w:right="-324.3307086614169" w:firstLine="0"/>
+        <w:jc w:val="both"/>
+        <w:rPr>
+          <w:rFonts w:ascii="Times New Roman" w:cs="Times New Roman" w:eastAsia="Times New Roman" w:hAnsi="Times New Roman"/>
+          <w:sz w:val="24"/>
+          <w:szCs w:val="24"/>
+        </w:rPr>
+      </w:pPr>
+      <w:r>
+        <w:rPr>
+          <w:rFonts w:ascii="Times New Roman" w:cs="Times New Roman" w:eastAsia="Times New Roman" w:hAnsi="Times New Roman"/>
+          <w:sz w:val="24"/>
+          <w:szCs w:val="24"/>
+          <w:rtl w:val="0"/>
+        </w:rPr>
+        <w:t xml:space="preserve">Persoana vizată are dreptul la informare, acces, rectificare, ștergere, restricționarea prelucrării, opoziție, portabilitate, dreptul de a nu fi supusă unei decizii bazate exclusiv pe prelucrarea automatizată, precum și dreptul de a-și retrage consimțământul. </w:t>
       </w:r>
     </w:p>
     <w:p>
@@ -1114,18 +1164,31 @@
         <w:jc w:val="both"/>
         <w:rPr>
           <w:rFonts w:ascii="Times New Roman" w:cs="Times New Roman" w:eastAsia="Times New Roman" w:hAnsi="Times New Roman"/>
-          <w:sz w:val="24"/>
-          <w:szCs w:val="24"/>
-        </w:rPr>
-      </w:pPr>
-      <w:r>
-        <w:rPr>
-          <w:rFonts w:ascii="Times New Roman" w:cs="Times New Roman" w:eastAsia="Times New Roman" w:hAnsi="Times New Roman"/>
-          <w:sz w:val="24"/>
-          <w:szCs w:val="24"/>
-          <w:rtl w:val="0"/>
-        </w:rPr>
-        <w:t xml:space="preserve">Utilizatorul (agentul) garantează că deține un temei legal pentru a încărca în Aplicație date cu caracter personal ale terților (proprietari, cumpărători), inclusiv, după caz, consimțământul acestora, și că respectă legislația privind protecția datelor.</w:t>
+          <w:b w:val="1"/>
+          <w:bCs w:val="1"/>
+          <w:sz w:val="24"/>
+          <w:szCs w:val="24"/>
+        </w:rPr>
+      </w:pPr>
+      <w:r>
+        <w:rPr>
+          <w:rFonts w:ascii="Times New Roman" w:cs="Times New Roman" w:eastAsia="Times New Roman" w:hAnsi="Times New Roman"/>
+          <w:sz w:val="24"/>
+          <w:szCs w:val="24"/>
+          <w:rtl w:val="0"/>
+        </w:rPr>
+        <w:t xml:space="preserve">Drepturile se exercită prin cerere la info@biseeth.md. Răspundem în maximum 36 de ore lucrătoare</w:t>
+      </w:r>
+      <w:r>
+        <w:rPr>
+          <w:rFonts w:ascii="Times New Roman" w:cs="Times New Roman" w:eastAsia="Times New Roman" w:hAnsi="Times New Roman"/>
+          <w:b w:val="1"/>
+          <w:bCs w:val="1"/>
+          <w:sz w:val="24"/>
+          <w:szCs w:val="24"/>
+          <w:rtl w:val="0"/>
+        </w:rPr>
+        <w:t xml:space="preserve">.</w:t>
       </w:r>
     </w:p>
     <w:p>
@@ -1154,7 +1217,7 @@
           <w:szCs w:val="25"/>
           <w:rtl w:val="0"/>
         </w:rPr>
-        <w:t xml:space="preserve">Cookie-uri</w:t>
+        <w:t xml:space="preserve">Responsabilitatea utilizatorului pentru datele terților</w:t>
       </w:r>
     </w:p>
     <w:p>
@@ -1175,7 +1238,7 @@
           <w:szCs w:val="24"/>
           <w:rtl w:val="0"/>
         </w:rPr>
-        <w:t xml:space="preserve">Aplicația poate utiliza cookie-uri și tehnologii similare pentru funcționare, securitate și statistici. Datele colectate anonim înainte de înregistrare (de exemplu, sursa vizitei) pot fi asociate contului dvs. după crearea acestuia, în scopul analizei utilizării platformei.</w:t>
+        <w:t xml:space="preserve">Utilizatorul (agentul) garantează că deține un temei legal pentru a încărca în Aplicație date cu caracter personal ale terților (proprietari, cumpărători), inclusiv, după caz, consimțământul acestora, și că respectă legislația privind protecția datelor.</w:t>
       </w:r>
     </w:p>
     <w:p>
@@ -1204,6 +1267,56 @@
           <w:szCs w:val="25"/>
           <w:rtl w:val="0"/>
         </w:rPr>
+        <w:t xml:space="preserve">Cookie-uri</w:t>
+      </w:r>
+    </w:p>
+    <w:p>
+      <w:pPr>
+        <w:spacing w:after="120" w:line="240" w:lineRule="auto"/>
+        <w:ind w:left="-425.19685039370086" w:right="-324.3307086614169" w:firstLine="0"/>
+        <w:jc w:val="both"/>
+        <w:rPr>
+          <w:rFonts w:ascii="Times New Roman" w:cs="Times New Roman" w:eastAsia="Times New Roman" w:hAnsi="Times New Roman"/>
+          <w:sz w:val="24"/>
+          <w:szCs w:val="24"/>
+        </w:rPr>
+      </w:pPr>
+      <w:r>
+        <w:rPr>
+          <w:rFonts w:ascii="Times New Roman" w:cs="Times New Roman" w:eastAsia="Times New Roman" w:hAnsi="Times New Roman"/>
+          <w:sz w:val="24"/>
+          <w:szCs w:val="24"/>
+          <w:rtl w:val="0"/>
+        </w:rPr>
+        <w:t xml:space="preserve">Aplicația poate utiliza cookie-uri și tehnologii similare pentru funcționare, securitate și statistici. Datele colectate anonim înainte de înregistrare (de exemplu, sursa vizitei) pot fi asociate contului dvs. după crearea acestuia, în scopul analizei utilizării platformei.</w:t>
+      </w:r>
+    </w:p>
+    <w:p>
+      <w:pPr>
+        <w:pStyle w:val="Heading2"/>
+        <w:keepNext w:val="0"/>
+        <w:keepLines w:val="0"/>
+        <w:spacing w:after="90" w:before="160" w:line="240" w:lineRule="auto"/>
+        <w:ind w:left="-425.19685039370086" w:right="-324.3307086614169" w:firstLine="0"/>
+        <w:rPr>
+          <w:rFonts w:ascii="Times New Roman" w:cs="Times New Roman" w:eastAsia="Times New Roman" w:hAnsi="Times New Roman"/>
+          <w:b w:val="1"/>
+          <w:bCs w:val="1"/>
+          <w:color w:val="3a4a57"/>
+          <w:sz w:val="25"/>
+          <w:szCs w:val="25"/>
+        </w:rPr>
+      </w:pPr>
+      <w:r>
+        <w:rPr>
+          <w:rFonts w:ascii="Times New Roman" w:cs="Times New Roman" w:eastAsia="Times New Roman" w:hAnsi="Times New Roman"/>
+          <w:b w:val="1"/>
+          <w:bCs w:val="1"/>
+          <w:color w:val="3a4a57"/>
+          <w:sz w:val="25"/>
+          <w:szCs w:val="25"/>
+          <w:rtl w:val="0"/>
+        </w:rPr>
         <w:t xml:space="preserve">Modificări</w:t>
       </w:r>
     </w:p>
@@ -1225,7 +1338,7 @@
           <w:szCs w:val="24"/>
           <w:rtl w:val="0"/>
         </w:rPr>
-        <w:t xml:space="preserve">Prezenta Politică poate fi actualizată. Versiunea în vigoare este publicată în Aplicație. Data ultimei actualizări: 20.06.2026.</w:t>
+        <w:t xml:space="preserve">Prezenta Politică poate fi actualizată. Versiunea în vigoare este publicată în Aplicație. Data ultimei actualizări: 23.10.2026.</w:t>
       </w:r>
     </w:p>
     <w:p>

</xml_diff>